<commit_message>
feat(demo): P23-T08 bank-grade annual review and facility renewal rewrite
36 catalog variables, covenant tables with loop blocks, CORP dual-page footers, and rich structured bindings for both templates.

Co-authored-by: Cursor <cursoragent@cursor.com>
</commit_message>
<xml_diff>
--- a/deploy/demo-annual-review/assets/annual-review-master.docx
+++ b/deploy/demo-annual-review/assets/annual-review-master.docx
@@ -16,39 +16,214 @@
     </w:p>
     <w:p>
       <w:r>
-        <w:t>{{anchor:ANNUAL_REVIEW_BODY}}</w:t>
-      </w:r>
-    </w:p>
-    <w:p>
-      <w:pPr>
-        <w:sectPr>
-          <w:type w:val="nextPage"/>
-          <w:pgNumType w:start="1"/>
-        </w:sectPr>
-      </w:pPr>
-    </w:p>
-    <w:p>
-      <w:pPr>
-        <w:jc w:val="center"/>
-      </w:pPr>
-      <w:r>
-        <w:rPr>
-          <w:b w:val="on"/>
-          <w:sz w:val="28"/>
-        </w:rPr>
-        <w:t>Schedule</w:t>
-      </w:r>
-    </w:p>
-    <w:p>
-      <w:r>
-        <w:t>{{anchor:ANNUAL_REVIEW_SCHEDULE}}</w:t>
+        <w:t>{{anchor:ARR_PARTIES}}</w:t>
+      </w:r>
+    </w:p>
+    <w:p>
+      <w:pPr>
+        <w:sectPr>
+          <w:type w:val="nextPage"/>
+          <w:pgNumType w:start="1"/>
+        </w:sectPr>
+      </w:pPr>
+    </w:p>
+    <w:p>
+      <w:pPr>
+        <w:jc w:val="left"/>
+      </w:pPr>
+      <w:r>
+        <w:rPr>
+          <w:b w:val="on"/>
+          <w:sz w:val="24"/>
+        </w:rPr>
+        <w:t>Defined Terms</w:t>
+      </w:r>
+    </w:p>
+    <w:p>
+      <w:r>
+        <w:t>{{anchor:ARR_DEFINED_TERMS}}</w:t>
+      </w:r>
+    </w:p>
+    <w:p>
+      <w:pPr>
+        <w:sectPr>
+          <w:type w:val="nextPage"/>
+          <w:pgNumType w:start="1"/>
+        </w:sectPr>
+      </w:pPr>
+    </w:p>
+    <w:p>
+      <w:pPr>
+        <w:jc w:val="left"/>
+      </w:pPr>
+      <w:r>
+        <w:rPr>
+          <w:b w:val="on"/>
+          <w:sz w:val="24"/>
+        </w:rPr>
+        <w:t>Review Summary</w:t>
+      </w:r>
+    </w:p>
+    <w:p>
+      <w:r>
+        <w:t>{{anchor:ARR_REVIEW_SUMMARY}}</w:t>
+      </w:r>
+    </w:p>
+    <w:p>
+      <w:pPr>
+        <w:sectPr>
+          <w:type w:val="nextPage"/>
+          <w:pgNumType w:start="1"/>
+        </w:sectPr>
+      </w:pPr>
+    </w:p>
+    <w:p>
+      <w:pPr>
+        <w:jc w:val="left"/>
+      </w:pPr>
+      <w:r>
+        <w:rPr>
+          <w:b w:val="on"/>
+          <w:sz w:val="24"/>
+        </w:rPr>
+        <w:t>Pricing Adjustment</w:t>
+      </w:r>
+    </w:p>
+    <w:p>
+      <w:r>
+        <w:t>{{anchor:ARR_PRICING}}</w:t>
+      </w:r>
+    </w:p>
+    <w:p>
+      <w:pPr>
+        <w:sectPr>
+          <w:type w:val="nextPage"/>
+          <w:pgNumType w:start="1"/>
+        </w:sectPr>
+      </w:pPr>
+    </w:p>
+    <w:p>
+      <w:pPr>
+        <w:jc w:val="left"/>
+      </w:pPr>
+      <w:r>
+        <w:rPr>
+          <w:b w:val="on"/>
+          <w:sz w:val="24"/>
+        </w:rPr>
+        <w:t>Covenant Compliance</w:t>
+      </w:r>
+    </w:p>
+    <w:p>
+      <w:r>
+        <w:t>{{anchor:ARR_COVENANTS}}</w:t>
+      </w:r>
+    </w:p>
+    <w:p>
+      <w:pPr>
+        <w:sectPr>
+          <w:type w:val="nextPage"/>
+          <w:pgNumType w:start="1"/>
+        </w:sectPr>
+      </w:pPr>
+    </w:p>
+    <w:p>
+      <w:pPr>
+        <w:jc w:val="left"/>
+      </w:pPr>
+      <w:r>
+        <w:rPr>
+          <w:b w:val="on"/>
+          <w:sz w:val="24"/>
+        </w:rPr>
+        <w:t>Material Findings</w:t>
+      </w:r>
+    </w:p>
+    <w:p>
+      <w:r>
+        <w:t>{{anchor:ARR_FINDINGS}}</w:t>
+      </w:r>
+    </w:p>
+    <w:p>
+      <w:pPr>
+        <w:sectPr>
+          <w:type w:val="nextPage"/>
+          <w:pgNumType w:start="1"/>
+        </w:sectPr>
+      </w:pPr>
+    </w:p>
+    <w:p>
+      <w:pPr>
+        <w:jc w:val="left"/>
+      </w:pPr>
+      <w:r>
+        <w:rPr>
+          <w:b w:val="on"/>
+          <w:sz w:val="24"/>
+        </w:rPr>
+        <w:t>Continued Availability</w:t>
+      </w:r>
+    </w:p>
+    <w:p>
+      <w:r>
+        <w:t>{{anchor:ARR_CONTINUATION}}</w:t>
+      </w:r>
+    </w:p>
+    <w:p>
+      <w:pPr>
+        <w:sectPr>
+          <w:type w:val="nextPage"/>
+          <w:pgNumType w:start="1"/>
+        </w:sectPr>
+      </w:pPr>
+    </w:p>
+    <w:p>
+      <w:pPr>
+        <w:jc w:val="left"/>
+      </w:pPr>
+      <w:r>
+        <w:rPr>
+          <w:b w:val="on"/>
+          <w:sz w:val="24"/>
+        </w:rPr>
+        <w:t>Governing Law</w:t>
+      </w:r>
+    </w:p>
+    <w:p>
+      <w:r>
+        <w:t>{{anchor:ARR_GOVERNING_LAW}}</w:t>
+      </w:r>
+    </w:p>
+    <w:p>
+      <w:pPr>
+        <w:sectPr>
+          <w:type w:val="nextPage"/>
+          <w:pgNumType w:start="1"/>
+        </w:sectPr>
+      </w:pPr>
+    </w:p>
+    <w:p>
+      <w:pPr>
+        <w:jc w:val="left"/>
+      </w:pPr>
+      <w:r>
+        <w:rPr>
+          <w:b w:val="on"/>
+          <w:sz w:val="24"/>
+        </w:rPr>
+        <w:t>Authorised Signatory</w:t>
+      </w:r>
+    </w:p>
+    <w:p>
+      <w:r>
+        <w:t>{{anchor:ARR_SIGNATURE}}</w:t>
       </w:r>
     </w:p>
     <w:sectPr>
-      <main:headerReference xmlns:main="http://schemas.openxmlformats.org/wordprocessingml/2006/main" xmlns:rel="http://schemas.openxmlformats.org/officeDocument/2006/relationships" main:type="default" rel:id="rId2"/>
-      <main:footerReference xmlns:main="http://schemas.openxmlformats.org/wordprocessingml/2006/main" xmlns:rel="http://schemas.openxmlformats.org/officeDocument/2006/relationships" main:type="default" rel:id="rId3"/>
+      <main:headerReference xmlns:main="http://schemas.openxmlformats.org/wordprocessingml/2006/main" xmlns:rel="http://schemas.openxmlformats.org/officeDocument/2006/relationships" main:type="default" rel:id="rId3"/>
+      <main:footerReference xmlns:main="http://schemas.openxmlformats.org/wordprocessingml/2006/main" xmlns:rel="http://schemas.openxmlformats.org/officeDocument/2006/relationships" main:type="default" rel:id="rId4"/>
       <main:pgSz xmlns:main="http://schemas.openxmlformats.org/wordprocessingml/2006/main" main:w="11906" main:h="16838"/>
-      <main:pgMar xmlns:main="http://schemas.openxmlformats.org/wordprocessingml/2006/main" main:top="1440" main:bottom="1440" main:left="1701" main:right="1276" main:header="708" main:footer="708" main:gutter="0"/>
+      <main:pgMar xmlns:main="http://schemas.openxmlformats.org/wordprocessingml/2006/main" main:top="1440" main:bottom="1440" main:left="1440" main:right="1440" main:header="708" main:footer="708" main:gutter="0"/>
     </w:sectPr>
   </w:body>
 </w:document>
@@ -57,8 +232,15 @@
 <file path=word/footer1.xml><?xml version="1.0" encoding="utf-8"?>
 <w:ftr xmlns:w="http://schemas.openxmlformats.org/wordprocessingml/2006/main">
   <w:p>
-    <w:r>
-      <w:t>Confidential — For authorised recipients only</w:t>
+    <w:pPr>
+      <w:jc w:val="left"/>
+    </w:pPr>
+    <w:r>
+      <w:rPr>
+        <w:sz w:val="14"/>
+        <w:color w:val="666666"/>
+      </w:rPr>
+      <w:t>25 Lombard Street, London EC3V 9AA  |  www.meridian-global.example  |  Regulated by the PRA &amp; FCA</w:t>
     </w:r>
   </w:p>
   <w:p>
@@ -160,8 +342,29 @@
 <file path=word/header1.xml><?xml version="1.0" encoding="utf-8"?>
 <w:hdr xmlns:w="http://schemas.openxmlformats.org/wordprocessingml/2006/main">
   <w:p>
-    <w:r>
-      <w:t>Meridian Corporate Banking — Relationship Management</w:t>
+    <w:pPr>
+      <w:jc w:val="left"/>
+    </w:pPr>
+    <w:r>
+      <w:rPr>
+        <w:b w:val="on"/>
+        <w:sz w:val="18"/>
+        <w:color w:val="003366"/>
+      </w:rPr>
+      <w:t>Meridian Global Banking Corporation — Corporate Credit</w:t>
+    </w:r>
+  </w:p>
+  <w:p>
+    <w:pPr>
+      <w:jc w:val="right"/>
+    </w:pPr>
+    <w:r>
+      <w:rPr>
+        <w:b w:val="on"/>
+        <w:sz w:val="14"/>
+        <w:color w:val="990000"/>
+      </w:rPr>
+      <w:t>STRICTLY PRIVATE AND CONFIDENTIAL</w:t>
     </w:r>
   </w:p>
 </w:hdr>
@@ -176,7 +379,7 @@
         <w:sz w:val="22"/>
         <w:szCs w:val="22"/>
         <w:color w:val="000000"/>
-        <w:lang w:val="en-US"/>
+        <w:lang w:val="en-US" w:bidi="en-US"/>
       </w:rPr>
     </w:rPrDefault>
     <w:pPrDefault>
@@ -194,5 +397,75 @@
       <w:lang w:val="en-US"/>
     </w:rPr>
   </w:style>
+  <w:style w:type="paragraph" w:styleId="Heading1">
+    <w:name w:val="Heading1"/>
+    <w:qFormat/>
+    <w:rPr>
+      <w:sz w:val="32"/>
+      <w:rFonts w:ascii="Cambria" w:hAnsi="Cambria" w:cs="Cambria"/>
+      <w:b/>
+    </w:rPr>
+  </w:style>
+  <w:style w:type="paragraph" w:styleId="Heading2">
+    <w:name w:val="Heading2"/>
+    <w:qFormat/>
+    <w:rPr>
+      <w:sz w:val="28"/>
+      <w:rFonts w:ascii="Cambria" w:hAnsi="Cambria" w:cs="Cambria"/>
+      <w:b/>
+    </w:rPr>
+  </w:style>
+  <w:style w:type="paragraph" w:styleId="Heading3">
+    <w:name w:val="Heading3"/>
+    <w:qFormat/>
+    <w:rPr>
+      <w:sz w:val="24"/>
+      <w:rFonts w:ascii="Cambria" w:hAnsi="Cambria" w:cs="Cambria"/>
+      <w:b/>
+    </w:rPr>
+  </w:style>
+  <w:style w:type="paragraph" w:styleId="ClauseBody">
+    <w:name w:val="ClauseBody"/>
+    <w:qFormat/>
+    <w:rPr>
+      <w:sz w:val="20"/>
+      <w:rFonts w:ascii="Calibri" w:hAnsi="Calibri" w:cs="Calibri"/>
+    </w:rPr>
+  </w:style>
+  <w:style w:type="paragraph" w:styleId="DefinedTerm">
+    <w:name w:val="DefinedTerm"/>
+    <w:qFormat/>
+    <w:rPr>
+      <w:sz w:val="20"/>
+      <w:rFonts w:ascii="Calibri" w:hAnsi="Calibri" w:cs="Calibri"/>
+      <w:b/>
+    </w:rPr>
+  </w:style>
+  <w:style w:type="paragraph" w:styleId="TableHeader">
+    <w:name w:val="TableHeader"/>
+    <w:qFormat/>
+    <w:rPr>
+      <w:sz w:val="20"/>
+      <w:rFonts w:ascii="Calibri" w:hAnsi="Calibri" w:cs="Calibri"/>
+      <w:b/>
+    </w:rPr>
+  </w:style>
+  <w:style w:type="paragraph" w:styleId="ScheduleTitle">
+    <w:name w:val="ScheduleTitle"/>
+    <w:qFormat/>
+    <w:rPr>
+      <w:sz w:val="26"/>
+      <w:rFonts w:ascii="Cambria" w:hAnsi="Cambria" w:cs="Cambria"/>
+      <w:b/>
+    </w:rPr>
+  </w:style>
+  <w:style w:type="paragraph" w:styleId="SignatureBlock">
+    <w:name w:val="SignatureBlock"/>
+    <w:qFormat/>
+    <w:rPr>
+      <w:sz w:val="20"/>
+      <w:rFonts w:ascii="Calibri" w:hAnsi="Calibri" w:cs="Calibri"/>
+    </w:rPr>
+  </w:style>
 </w:styles>
 </file>
</xml_diff>

<commit_message>
feat(IBL-E1): locale variant template and clause model (#128)
Persist documentLocale/variantFamilyKey, publish/runtime locale gates, OpenAPI ADR-0062 sync, and management UI family navigation with E2E evidence.

Co-authored-by: Cursor <cursoragent@cursor.com>
</commit_message>
<xml_diff>
--- a/deploy/demo-annual-review/assets/annual-review-master.docx
+++ b/deploy/demo-annual-review/assets/annual-review-master.docx
@@ -376,8 +376,8 @@
     <w:rPrDefault>
       <w:rPr>
         <w:rFonts w:ascii="Calibri" w:hAnsi="Calibri" w:cs="Calibri" w:eastAsia="Calibri"/>
-        <w:sz w:val="22"/>
-        <w:szCs w:val="22"/>
+        <w:sz w:val="20"/>
+        <w:szCs w:val="20"/>
         <w:color w:val="000000"/>
         <w:lang w:val="en-US" w:bidi="en-US"/>
       </w:rPr>
@@ -391,8 +391,8 @@
     <w:qFormat/>
     <w:rPr>
       <w:rFonts w:ascii="Calibri" w:hAnsi="Calibri" w:cs="Calibri" w:eastAsia="Calibri"/>
-      <w:sz w:val="22"/>
-      <w:szCs w:val="22"/>
+      <w:sz w:val="20"/>
+      <w:szCs w:val="20"/>
       <w:color w:val="000000"/>
       <w:lang w:val="en-US"/>
     </w:rPr>
@@ -402,7 +402,7 @@
     <w:qFormat/>
     <w:rPr>
       <w:sz w:val="32"/>
-      <w:rFonts w:ascii="Cambria" w:hAnsi="Cambria" w:cs="Cambria"/>
+      <w:rFonts w:ascii="Cambria" w:hAnsi="Cambria" w:cs="Cambria" w:eastAsia="Cambria"/>
       <w:b/>
     </w:rPr>
   </w:style>
@@ -411,7 +411,7 @@
     <w:qFormat/>
     <w:rPr>
       <w:sz w:val="28"/>
-      <w:rFonts w:ascii="Cambria" w:hAnsi="Cambria" w:cs="Cambria"/>
+      <w:rFonts w:ascii="Cambria" w:hAnsi="Cambria" w:cs="Cambria" w:eastAsia="Cambria"/>
       <w:b/>
     </w:rPr>
   </w:style>
@@ -420,7 +420,7 @@
     <w:qFormat/>
     <w:rPr>
       <w:sz w:val="24"/>
-      <w:rFonts w:ascii="Cambria" w:hAnsi="Cambria" w:cs="Cambria"/>
+      <w:rFonts w:ascii="Cambria" w:hAnsi="Cambria" w:cs="Cambria" w:eastAsia="Cambria"/>
       <w:b/>
     </w:rPr>
   </w:style>
@@ -429,7 +429,7 @@
     <w:qFormat/>
     <w:rPr>
       <w:sz w:val="20"/>
-      <w:rFonts w:ascii="Calibri" w:hAnsi="Calibri" w:cs="Calibri"/>
+      <w:rFonts w:ascii="Calibri" w:hAnsi="Calibri" w:cs="Calibri" w:eastAsia="Calibri"/>
     </w:rPr>
   </w:style>
   <w:style w:type="paragraph" w:styleId="DefinedTerm">
@@ -437,7 +437,7 @@
     <w:qFormat/>
     <w:rPr>
       <w:sz w:val="20"/>
-      <w:rFonts w:ascii="Calibri" w:hAnsi="Calibri" w:cs="Calibri"/>
+      <w:rFonts w:ascii="Calibri" w:hAnsi="Calibri" w:cs="Calibri" w:eastAsia="Calibri"/>
       <w:b/>
     </w:rPr>
   </w:style>
@@ -446,7 +446,7 @@
     <w:qFormat/>
     <w:rPr>
       <w:sz w:val="20"/>
-      <w:rFonts w:ascii="Calibri" w:hAnsi="Calibri" w:cs="Calibri"/>
+      <w:rFonts w:ascii="Calibri" w:hAnsi="Calibri" w:cs="Calibri" w:eastAsia="Calibri"/>
       <w:b/>
     </w:rPr>
   </w:style>
@@ -455,7 +455,7 @@
     <w:qFormat/>
     <w:rPr>
       <w:sz w:val="26"/>
-      <w:rFonts w:ascii="Cambria" w:hAnsi="Cambria" w:cs="Cambria"/>
+      <w:rFonts w:ascii="Cambria" w:hAnsi="Cambria" w:cs="Cambria" w:eastAsia="Cambria"/>
       <w:b/>
     </w:rPr>
   </w:style>
@@ -464,7 +464,7 @@
     <w:qFormat/>
     <w:rPr>
       <w:sz w:val="20"/>
-      <w:rFonts w:ascii="Calibri" w:hAnsi="Calibri" w:cs="Calibri"/>
+      <w:rFonts w:ascii="Calibri" w:hAnsi="Calibri" w:cs="Calibri" w:eastAsia="Calibri"/>
     </w:rPr>
   </w:style>
 </w:styles>

</xml_diff>

<commit_message>
feat(fos): Word foundation honesty WF-1…WF-8 (FOS-W15 / #185)
Nested table/list render + order-preserving writeBlockNodes; FOL headerRows
fix; style-manifest spacing/eastAsia; generated-letter typography gate;
clause/money honesty docs; FOL logo letterhead (word/media). Deploy BLOCKED.

Co-authored-by: bigballgis <bigballgis@users.noreply.github.com>
</commit_message>
<xml_diff>
--- a/deploy/demo-annual-review/assets/annual-review-master.docx
+++ b/deploy/demo-annual-review/assets/annual-review-master.docx
@@ -402,7 +402,7 @@
     <w:qFormat/>
     <w:rPr>
       <w:sz w:val="32"/>
-      <w:rFonts w:ascii="Cambria" w:hAnsi="Cambria" w:cs="Cambria" w:eastAsia="Cambria"/>
+      <w:rFonts w:ascii="Cambria" w:hAnsi="Cambria" w:cs="Cambria" w:eastAsia="Noto Sans CJK SC"/>
       <w:b/>
     </w:rPr>
   </w:style>
@@ -411,7 +411,7 @@
     <w:qFormat/>
     <w:rPr>
       <w:sz w:val="28"/>
-      <w:rFonts w:ascii="Cambria" w:hAnsi="Cambria" w:cs="Cambria" w:eastAsia="Cambria"/>
+      <w:rFonts w:ascii="Cambria" w:hAnsi="Cambria" w:cs="Cambria" w:eastAsia="Noto Sans CJK SC"/>
       <w:b/>
     </w:rPr>
   </w:style>
@@ -420,16 +420,19 @@
     <w:qFormat/>
     <w:rPr>
       <w:sz w:val="24"/>
-      <w:rFonts w:ascii="Cambria" w:hAnsi="Cambria" w:cs="Cambria" w:eastAsia="Cambria"/>
+      <w:rFonts w:ascii="Cambria" w:hAnsi="Cambria" w:cs="Cambria" w:eastAsia="Noto Sans CJK SC"/>
       <w:b/>
     </w:rPr>
   </w:style>
   <w:style w:type="paragraph" w:styleId="ClauseBody">
     <w:name w:val="ClauseBody"/>
     <w:qFormat/>
+    <w:pPr>
+      <w:spacing w:after="120"/>
+    </w:pPr>
     <w:rPr>
       <w:sz w:val="20"/>
-      <w:rFonts w:ascii="Calibri" w:hAnsi="Calibri" w:cs="Calibri" w:eastAsia="Calibri"/>
+      <w:rFonts w:ascii="Calibri" w:hAnsi="Calibri" w:cs="Calibri" w:eastAsia="Noto Sans CJK SC"/>
     </w:rPr>
   </w:style>
   <w:style w:type="paragraph" w:styleId="DefinedTerm">
@@ -437,7 +440,7 @@
     <w:qFormat/>
     <w:rPr>
       <w:sz w:val="20"/>
-      <w:rFonts w:ascii="Calibri" w:hAnsi="Calibri" w:cs="Calibri" w:eastAsia="Calibri"/>
+      <w:rFonts w:ascii="Calibri" w:hAnsi="Calibri" w:cs="Calibri" w:eastAsia="Noto Sans CJK SC"/>
       <w:b/>
     </w:rPr>
   </w:style>
@@ -446,7 +449,7 @@
     <w:qFormat/>
     <w:rPr>
       <w:sz w:val="20"/>
-      <w:rFonts w:ascii="Calibri" w:hAnsi="Calibri" w:cs="Calibri" w:eastAsia="Calibri"/>
+      <w:rFonts w:ascii="Calibri" w:hAnsi="Calibri" w:cs="Calibri" w:eastAsia="Noto Sans CJK SC"/>
       <w:b/>
     </w:rPr>
   </w:style>
@@ -455,16 +458,19 @@
     <w:qFormat/>
     <w:rPr>
       <w:sz w:val="26"/>
-      <w:rFonts w:ascii="Cambria" w:hAnsi="Cambria" w:cs="Cambria" w:eastAsia="Cambria"/>
+      <w:rFonts w:ascii="Cambria" w:hAnsi="Cambria" w:cs="Cambria" w:eastAsia="Noto Sans CJK SC"/>
       <w:b/>
     </w:rPr>
   </w:style>
   <w:style w:type="paragraph" w:styleId="SignatureBlock">
     <w:name w:val="SignatureBlock"/>
     <w:qFormat/>
+    <w:pPr>
+      <w:spacing w:before="240" w:after="120"/>
+    </w:pPr>
     <w:rPr>
       <w:sz w:val="20"/>
-      <w:rFonts w:ascii="Calibri" w:hAnsi="Calibri" w:cs="Calibri" w:eastAsia="Calibri"/>
+      <w:rFonts w:ascii="Calibri" w:hAnsi="Calibri" w:cs="Calibri" w:eastAsia="Noto Sans CJK SC"/>
     </w:rPr>
   </w:style>
 </w:styles>

</xml_diff>